<commit_message>
Amend Stage 3B protocol: new-cohort requirement with prior-play screening item; blinding note
Co-Authored-By: Claude Fable 5 <noreply@anthropic.com>
Claude-Session: https://claude.ai/code/session_01KoT3i8geZspYBMMKVYJUTG
</commit_message>
<xml_diff>
--- a/docs/thesis/stage3b/Stage3B_Mini_Protocol_DRAFT.docx
+++ b/docs/thesis/stage3b/Stage3B_Mini_Protocol_DRAFT.docx
@@ -81,6 +81,9 @@
       <w:r>
         <w:t>Option A (recommended if N &gt;= 40): two-arm, individually randomised at first launch inside the build. Arm 1 'adaptive': rule-agent difficulty calibration + trajectory display ('your best runs over time') + coaching messages. Arm 2 'static': fixed moderate difficulty, plain score display, no coaching. Same game, same length, same questionnaire. This is the cleanest first test of the framework: the only differences between arms are the framework elements themselves.</w:t>
       </w:r>
+      <w:r>
+        <w:t xml:space="preserve"> Blinding: all participants receive the identical build and are not told that two presentation variants exist; assignment is silent and random at first launch. The consent screen truthfully describes the activity, recording and voluntariness — variant assignment is presentation-level A/B allocation.</w:t>
+      </w:r>
     </w:p>
     <w:p>
       <w:r>
@@ -103,6 +106,9 @@
     <w:p>
       <w:r>
         <w:t>Target: 40-60 community-dwelling adults aged 25-80, recruited in the same three bands as Stage 3 (25-44 / 45-64 / 65-80) for continuity, with the 65-80 band prioritised. Recruitment by e-mail/messaging invitation through the author's networks and named distributors, each logged in the channel map from day one (invitation date, chain, target range). Consent: RECORDED in-build — a consent screen stating the research purpose, voluntariness, anonymity and data use, requiring an explicit tap/click before play; the consent event is written into the export. This upgrades Stage 3's implied-consent model.</w:t>
+      </w:r>
+      <w:r>
+        <w:t xml:space="preserve"> COHORT INDEPENDENCE: participants must be NEW — Stage-3 (March-April) players are not re-recruited, for the same contamination reason the Stage-2 facility was not re-used in Stage 3 (prior exposure invalidates first-contact behaviour and practice effects distort calibration). Distribution CHANNELS may be re-used; distributors invite different people. Safeguard: the enrolment screen includes one screening item — 'Did you play the skiing game earlier this year? Yes/No' — and any 'Yes' participant is flagged at entry and analysed separately (excluded from primary outcomes), never silently pooled.</w:t>
       </w:r>
     </w:p>
     <w:p>

</xml_diff>

<commit_message>
Add Stage 3B channel plan: business-school and community-centre channels with safeguards; age collected as band only
Band-only decision matches the approved application's data-minimisation text. Student-recruitment voluntariness line and centre gatekeeper+setting-logging requirements added. Revised expected N 80-120.

Co-Authored-By: Claude Fable 5 <noreply@anthropic.com>
Claude-Session: https://claude.ai/code/session_01KoT3i8geZspYBMMKVYJUTG
</commit_message>
<xml_diff>
--- a/docs/thesis/stage3b/Stage3B_Mini_Protocol_DRAFT.docx
+++ b/docs/thesis/stage3b/Stage3B_Mini_Protocol_DRAFT.docx
@@ -110,6 +110,9 @@
       <w:r>
         <w:t xml:space="preserve"> COHORT INDEPENDENCE: participants must be NEW — Stage-3 (March-April) players are not re-recruited, for the same contamination reason the Stage-2 facility was not re-used in Stage 3 (prior exposure invalidates first-contact behaviour and practice effects distort calibration). Distribution CHANNELS may be re-used; distributors invite different people. Safeguard: the enrolment screen includes one screening item — 'Did you play the skiing game earlier this year? Yes/No' — and any 'Yes' participant is flagged at entry and analysed separately (excluded from primary outcomes), never silently pooled.</w:t>
       </w:r>
+      <w:r>
+        <w:t xml:space="preserve"> CHANNEL PLAN (8 Aug 2026): (i) university business-school network (100+ adults 40+) — primary source for the 45-64 band; SAFEGUARD: any invitation reaching current students states that participation is voluntary, anonymous and unrelated to any course, assessment or relationship with the researcher; (ii) elderly house / day community centre — target 20-30 in the 65-80 band via on-site sessions; REQUIREMENTS: centre manager's recorded agreement (gatekeeper permission) PLUS individual in-build consent; setting logged per channel (community-centre vs remote) and reported as a context covariate; facilitators may assist with the device but never with gameplay; (iii) existing distributor chains + personal network for the 25-44 band (15-25). Revised expected N: 80-120, making the two-arm design (Option A) well powered.</w:t>
+      </w:r>
     </w:p>
     <w:p>
       <w:pPr>
@@ -122,6 +125,9 @@
     <w:p>
       <w:r>
         <w:t>The v3.0 build collects, in ONE export file per participant: (a) consent event; (b) enrolment — age band, gender, education (no names); (c) session telemetry and state-change log (rule-agent decisions logged with reasons); (d) end-screen questionnaire: D1 (coordination-challenge endorsement) and D2 (regular-play intention) unchanged for comparability, plus two framework items: F1 'the game matched my ability' and F2 'seeing my progress made me want to continue'; (e) arm assignment (Option A). Response scale: [5-point, confirm against Appendix D decision]. Return: one share-sheet/e-mail action; every return logged with date on arrival.</w:t>
+      </w:r>
+      <w:r>
+        <w:t xml:space="preserve"> AGE RESOLUTION DECISION (8 Aug 2026): age is collected as the BAND ONLY (25-44 / 45-64 / 65-80) — matching the approved application's data-minimisation description, preserving anonymity in small identifiable communities, and keeping band-level comparability with Stage 3. Exact age is NOT collected.</w:t>
       </w:r>
     </w:p>
     <w:p>

</xml_diff>